<commit_message>
Datos para probar fuera del costado y toques de la paleta secundaria
- Los datos para probar salen del costado del cotizador, que vuelve a
  empezar por la promoción, y pasan a una franja compacta dentro del
  marco, sobre el formulario, igual en computador y celular. Los datos
  van como fichas que se copian con un clic.
- Toques de la paleta secundaria (el brandbook permite en web aumentar
  su uso): Cerceta #19BAB6 para servicio y beneficios (trazo antes de cada
  antetítulo, trámites, íconos de beneficios, Mundo Zurich) y Durazno
  #FF7569 para la promoción (punto de «Oferta del mes», círculo del
  regalo, borde del gancho). Las formas llevan dos azules y estos dos
  acentos. Encima solo azul oscuro; nunca texto blanco.
- Verificador: 1.053 comprobaciones, 0 fallas. Documentos v1.5 y capturas.

Co-Authored-By: Claude Opus 5.5 <noreply@anthropic.com>
Claude-Session: https://claude.ai/code/session_01NHkXXLT6YPKEXfXqiB4jeM
</commit_message>
<xml_diff>
--- a/_entregables/documentacion_general_tecnica_seguros_zurich_bice.docx
+++ b/_entregables/documentacion_general_tecnica_seguros_zurich_bice.docx
@@ -394,7 +394,7 @@
                 <w:sz w:val="18"/>
                 <w:szCs w:val="18"/>
               </w:rPr>
-              <w:t xml:space="preserve">1.4 · 10 de octubre de 2026</w:t>
+              <w:t xml:space="preserve">1.5 · 10 de octubre de 2026</w:t>
             </w:r>
           </w:p>
         </w:tc>
@@ -7202,7 +7202,7 @@
           <w:sz w:val="21"/>
           <w:szCs w:val="21"/>
         </w:rPr>
-        <w:t xml:space="preserve">Datos para probar, a la vista: botón «Datos para probar» abajo a la izquierda en todas las páginas (también en el acceso), con los correos de acceso, los dos clientes ficticios y la cédula, cada uno con botón «Copiar». Junto a cada cotizador de demostración, los datos del paso en que va la persona y el botón «Completar este paso», que los escribe en el cotizador; en el celular va arriba del cotizador. En el acceso y en MatIAs, los datos se escriben con un clic. Las autorizaciones, las declaraciones y los documentos los marca siempre la persona. Se apaga en Configuración › Contenidos › Secciones.</w:t>
+        <w:t xml:space="preserve">Datos para probar, a la vista: botón «Datos para probar» abajo a la izquierda en todas las páginas (también en el acceso), con los correos de acceso, los dos clientes ficticios y la cédula, cada uno con botón «Copiar». Dentro del marco de cada cotizador de demostración, sobre el formulario, una franja con los datos del paso en que va la persona, que se copian con un clic, y el botón «Completar este paso», que los escribe en el cotizador. No va al costado: ese espacio es de la promoción. En el acceso y en MatIAs, los datos se escriben con un clic. Las autorizaciones, las declaraciones y los documentos los marca siempre la persona. Se apaga en Configuración › Contenidos › Secciones.</w:t>
       </w:r>
     </w:p>
     <w:p>
@@ -7238,7 +7238,7 @@
           <w:sz w:val="21"/>
           <w:szCs w:val="21"/>
         </w:rPr>
-        <w:t xml:space="preserve">node _herramientas/verificar.mjs (requiere Playwright con Chromium). Última ejecución: 1.051 comprobaciones correctas, 0 fallas, con las tres compras completas dentro del sitio, las conversaciones de MatIAs y los datos para probar.</w:t>
+        <w:t xml:space="preserve">node _herramientas/verificar.mjs (requiere Playwright con Chromium). Última ejecución: 1.053 comprobaciones correctas, 0 fallas, con las tres compras completas dentro del sitio, las conversaciones de MatIAs y los datos para probar.</w:t>
       </w:r>
     </w:p>
     <w:p>
@@ -7993,7 +7993,26 @@
           <w:sz w:val="21"/>
           <w:szCs w:val="21"/>
         </w:rPr>
-        <w:t xml:space="preserve">Lenguaje de formas de cuatro piezas, apoyado en divisores.</w:t>
+        <w:t xml:space="preserve">Lenguaje de formas de cuatro piezas, apoyado en divisores: dos azules de marca y dos acentos de la paleta secundaria.</w:t>
+      </w:r>
+    </w:p>
+    <w:p>
+      <w:pPr>
+        <w:pStyle w:val="ListParagraph"/>
+        <w:numPr>
+          <w:ilvl w:val="0"/>
+          <w:numId w:val="2"/>
+        </w:numPr>
+        <w:spacing w:after="80" w:line="290"/>
+      </w:pPr>
+      <w:r>
+        <w:rPr>
+          <w:rFonts w:ascii="Arial" w:cs="Arial" w:eastAsia="Arial" w:hAnsi="Arial"/>
+          <w:color w:val="23366F"/>
+          <w:sz w:val="21"/>
+          <w:szCs w:val="21"/>
+        </w:rPr>
+        <w:t xml:space="preserve">Paleta secundaria como acento (el brandbook permite en sitios web aumentar su uso; pedido del dueño del proyecto: que no quede todo azul). Se eligieron dos: Cerceta #19BAB6 para servicio y beneficios (trazo antes de cada antetítulo, círculos de los trámites, íconos de beneficios) y Durazno #FF7569 para la promoción (punto de «Oferta del mes», círculo del regalo, borde del gancho). Encima solo azul oscuro (Cerceta 4,78:1; Durazno 4,38:1, solo en íconos), nunca texto blanco ni fondo completo sobre una foto.</w:t>
       </w:r>
     </w:p>
     <w:p>
@@ -8031,7 +8050,7 @@
           <w:sz w:val="21"/>
           <w:szCs w:val="21"/>
         </w:rPr>
-        <w:t xml:space="preserve">Contraste AA verificado en 4.918 textos de todas las páginas y pantallas, también con MatIAs y los datos para probar abiertos.</w:t>
+        <w:t xml:space="preserve">Contraste AA verificado en 4.901 textos de todas las páginas y pantallas, también con MatIAs y los datos para probar abiertos.</w:t>
       </w:r>
     </w:p>
     <w:p>
@@ -10404,6 +10423,135 @@
           </w:p>
         </w:tc>
       </w:tr>
+      <w:tr>
+        <w:trPr>
+          <w:tblHeader w:val="false"/>
+        </w:trPr>
+        <w:tc>
+          <w:tcPr>
+            <w:tcW w:type="dxa" w:w="1300"/>
+            <w:tcBorders>
+              <w:top w:val="single" w:color="C9D2DC" w:sz="4"/>
+              <w:left w:val="single" w:color="C9D2DC" w:sz="4"/>
+              <w:bottom w:val="single" w:color="C9D2DC" w:sz="4"/>
+              <w:right w:val="single" w:color="C9D2DC" w:sz="4"/>
+            </w:tcBorders>
+            <w:shd w:fill="F3F5F6" w:color="auto" w:val="clear"/>
+            <w:tcMar>
+              <w:top w:type="dxa" w:w="60"/>
+              <w:left w:type="dxa" w:w="100"/>
+              <w:bottom w:type="dxa" w:w="60"/>
+              <w:right w:type="dxa" w:w="100"/>
+            </w:tcMar>
+          </w:tcPr>
+          <w:p>
+            <w:r>
+              <w:rPr>
+                <w:rFonts w:ascii="Arial" w:cs="Arial" w:eastAsia="Arial" w:hAnsi="Arial"/>
+                <w:b w:val="false"/>
+                <w:bCs w:val="false"/>
+                <w:color w:val="23366F"/>
+                <w:sz w:val="18"/>
+                <w:szCs w:val="18"/>
+              </w:rPr>
+              <w:t xml:space="preserve">10-10-2026</w:t>
+            </w:r>
+          </w:p>
+        </w:tc>
+        <w:tc>
+          <w:tcPr>
+            <w:tcW w:type="dxa" w:w="1500"/>
+            <w:tcBorders>
+              <w:top w:val="single" w:color="C9D2DC" w:sz="4"/>
+              <w:left w:val="single" w:color="C9D2DC" w:sz="4"/>
+              <w:bottom w:val="single" w:color="C9D2DC" w:sz="4"/>
+              <w:right w:val="single" w:color="C9D2DC" w:sz="4"/>
+            </w:tcBorders>
+            <w:shd w:fill="F3F5F6" w:color="auto" w:val="clear"/>
+            <w:tcMar>
+              <w:top w:type="dxa" w:w="60"/>
+              <w:left w:type="dxa" w:w="100"/>
+              <w:bottom w:type="dxa" w:w="60"/>
+              <w:right w:type="dxa" w:w="100"/>
+            </w:tcMar>
+          </w:tcPr>
+          <w:p>
+            <w:r>
+              <w:rPr>
+                <w:rFonts w:ascii="Arial" w:cs="Arial" w:eastAsia="Arial" w:hAnsi="Arial"/>
+                <w:b w:val="false"/>
+                <w:bCs w:val="false"/>
+                <w:color w:val="23366F"/>
+                <w:sz w:val="18"/>
+                <w:szCs w:val="18"/>
+              </w:rPr>
+              <w:t xml:space="preserve">Claude Code</w:t>
+            </w:r>
+          </w:p>
+        </w:tc>
+        <w:tc>
+          <w:tcPr>
+            <w:tcW w:type="dxa" w:w="3500"/>
+            <w:tcBorders>
+              <w:top w:val="single" w:color="C9D2DC" w:sz="4"/>
+              <w:left w:val="single" w:color="C9D2DC" w:sz="4"/>
+              <w:bottom w:val="single" w:color="C9D2DC" w:sz="4"/>
+              <w:right w:val="single" w:color="C9D2DC" w:sz="4"/>
+            </w:tcBorders>
+            <w:shd w:fill="F3F5F6" w:color="auto" w:val="clear"/>
+            <w:tcMar>
+              <w:top w:type="dxa" w:w="60"/>
+              <w:left w:type="dxa" w:w="100"/>
+              <w:bottom w:type="dxa" w:w="60"/>
+              <w:right w:type="dxa" w:w="100"/>
+            </w:tcMar>
+          </w:tcPr>
+          <w:p>
+            <w:r>
+              <w:rPr>
+                <w:rFonts w:ascii="Arial" w:cs="Arial" w:eastAsia="Arial" w:hAnsi="Arial"/>
+                <w:b w:val="false"/>
+                <w:bCs w:val="false"/>
+                <w:color w:val="23366F"/>
+                <w:sz w:val="18"/>
+                <w:szCs w:val="18"/>
+              </w:rPr>
+              <w:t xml:space="preserve">No quitarle a la publicidad el espacio del costado con los datos para probar; usar levemente la paleta secundaria para que no quede tan azul</w:t>
+            </w:r>
+          </w:p>
+        </w:tc>
+        <w:tc>
+          <w:tcPr>
+            <w:tcW w:type="dxa" w:w="3338"/>
+            <w:tcBorders>
+              <w:top w:val="single" w:color="C9D2DC" w:sz="4"/>
+              <w:left w:val="single" w:color="C9D2DC" w:sz="4"/>
+              <w:bottom w:val="single" w:color="C9D2DC" w:sz="4"/>
+              <w:right w:val="single" w:color="C9D2DC" w:sz="4"/>
+            </w:tcBorders>
+            <w:shd w:fill="F3F5F6" w:color="auto" w:val="clear"/>
+            <w:tcMar>
+              <w:top w:type="dxa" w:w="60"/>
+              <w:left w:type="dxa" w:w="100"/>
+              <w:bottom w:type="dxa" w:w="60"/>
+              <w:right w:type="dxa" w:w="100"/>
+            </w:tcMar>
+          </w:tcPr>
+          <w:p>
+            <w:r>
+              <w:rPr>
+                <w:rFonts w:ascii="Arial" w:cs="Arial" w:eastAsia="Arial" w:hAnsi="Arial"/>
+                <w:b w:val="false"/>
+                <w:bCs w:val="false"/>
+                <w:color w:val="23366F"/>
+                <w:sz w:val="18"/>
+                <w:szCs w:val="18"/>
+              </w:rPr>
+              <w:t xml:space="preserve">Datos para probar en una franja dentro del marco del cotizador; Cerceta y Durazno como acentos; 1.053 comprobaciones, 0 fallas</w:t>
+            </w:r>
+          </w:p>
+        </w:tc>
+      </w:tr>
     </w:tbl>
     <w:p>
       <w:pPr>
@@ -11088,6 +11236,104 @@
                 <w:szCs w:val="18"/>
               </w:rPr>
               <w:t xml:space="preserve">Datos para probar a la vista (botón fijo, junto a cada cotizador con «Completar este paso», en el acceso y en MatIAs) y segunda pasada de alturas</w:t>
+            </w:r>
+          </w:p>
+        </w:tc>
+      </w:tr>
+      <w:tr>
+        <w:trPr>
+          <w:tblHeader w:val="false"/>
+        </w:trPr>
+        <w:tc>
+          <w:tcPr>
+            <w:tcW w:type="dxa" w:w="1300"/>
+            <w:tcBorders>
+              <w:top w:val="single" w:color="C9D2DC" w:sz="4"/>
+              <w:left w:val="single" w:color="C9D2DC" w:sz="4"/>
+              <w:bottom w:val="single" w:color="C9D2DC" w:sz="4"/>
+              <w:right w:val="single" w:color="C9D2DC" w:sz="4"/>
+            </w:tcBorders>
+            <w:shd w:fill="F3F5F6" w:color="auto" w:val="clear"/>
+            <w:tcMar>
+              <w:top w:type="dxa" w:w="60"/>
+              <w:left w:type="dxa" w:w="100"/>
+              <w:bottom w:type="dxa" w:w="60"/>
+              <w:right w:type="dxa" w:w="100"/>
+            </w:tcMar>
+          </w:tcPr>
+          <w:p>
+            <w:r>
+              <w:rPr>
+                <w:rFonts w:ascii="Arial" w:cs="Arial" w:eastAsia="Arial" w:hAnsi="Arial"/>
+                <w:b w:val="false"/>
+                <w:bCs w:val="false"/>
+                <w:color w:val="23366F"/>
+                <w:sz w:val="18"/>
+                <w:szCs w:val="18"/>
+              </w:rPr>
+              <w:t xml:space="preserve">1.5</w:t>
+            </w:r>
+          </w:p>
+        </w:tc>
+        <w:tc>
+          <w:tcPr>
+            <w:tcW w:type="dxa" w:w="2600"/>
+            <w:tcBorders>
+              <w:top w:val="single" w:color="C9D2DC" w:sz="4"/>
+              <w:left w:val="single" w:color="C9D2DC" w:sz="4"/>
+              <w:bottom w:val="single" w:color="C9D2DC" w:sz="4"/>
+              <w:right w:val="single" w:color="C9D2DC" w:sz="4"/>
+            </w:tcBorders>
+            <w:shd w:fill="F3F5F6" w:color="auto" w:val="clear"/>
+            <w:tcMar>
+              <w:top w:type="dxa" w:w="60"/>
+              <w:left w:type="dxa" w:w="100"/>
+              <w:bottom w:type="dxa" w:w="60"/>
+              <w:right w:type="dxa" w:w="100"/>
+            </w:tcMar>
+          </w:tcPr>
+          <w:p>
+            <w:r>
+              <w:rPr>
+                <w:rFonts w:ascii="Arial" w:cs="Arial" w:eastAsia="Arial" w:hAnsi="Arial"/>
+                <w:b w:val="false"/>
+                <w:bCs w:val="false"/>
+                <w:color w:val="23366F"/>
+                <w:sz w:val="18"/>
+                <w:szCs w:val="18"/>
+              </w:rPr>
+              <w:t xml:space="preserve">10 de octubre de 2026</w:t>
+            </w:r>
+          </w:p>
+        </w:tc>
+        <w:tc>
+          <w:tcPr>
+            <w:tcW w:type="dxa" w:w="5738"/>
+            <w:tcBorders>
+              <w:top w:val="single" w:color="C9D2DC" w:sz="4"/>
+              <w:left w:val="single" w:color="C9D2DC" w:sz="4"/>
+              <w:bottom w:val="single" w:color="C9D2DC" w:sz="4"/>
+              <w:right w:val="single" w:color="C9D2DC" w:sz="4"/>
+            </w:tcBorders>
+            <w:shd w:fill="F3F5F6" w:color="auto" w:val="clear"/>
+            <w:tcMar>
+              <w:top w:type="dxa" w:w="60"/>
+              <w:left w:type="dxa" w:w="100"/>
+              <w:bottom w:type="dxa" w:w="60"/>
+              <w:right w:type="dxa" w:w="100"/>
+            </w:tcMar>
+          </w:tcPr>
+          <w:p>
+            <w:r>
+              <w:rPr>
+                <w:rFonts w:ascii="Arial" w:cs="Arial" w:eastAsia="Arial" w:hAnsi="Arial"/>
+                <w:b w:val="false"/>
+                <w:bCs w:val="false"/>
+                <w:color w:val="23366F"/>
+                <w:sz w:val="18"/>
+                <w:szCs w:val="18"/>
+              </w:rPr>
+              <w:t xml:space="preserve">Datos para probar dentro del marco del cotizador (el costado es de la promoción) y toques de la paleta secundaria: Cerceta y Durazno</w:t>
             </w:r>
           </w:p>
         </w:tc>

</xml_diff>